<commit_message>
docs: finalize logo-free project report and clean up all temporary documents
</commit_message>
<xml_diff>
--- a/Brain_Tumor_Detection_Project_Report.docx
+++ b/Brain_Tumor_Detection_Project_Report.docx
@@ -83,9 +83,11 @@
           <w:rFonts w:ascii="Times New Roman" w:hAnsi="Times New Roman"/>
           <w:b/>
           <w:i w:val="0"/>
-          <w:sz w:val="22"/>
+          <w:sz w:val="24"/>
         </w:rPr>
-        <w:t>JAWAHARLAL NEHRU TECHNOLOGICAL UNIVERSITY ANANTAPUR, ANANTHAPURAMU</w:t>
+        <w:t>SRI VENKATESWARA COLLEGE OF ENGINEERING AND TECHNOLOGY (AUTONOMOUS)</w:t>
+        <w:br/>
+        <w:t>CHITTOOR</w:t>
       </w:r>
     </w:p>
     <w:p>
@@ -109,6 +111,14 @@
         <w:tblW w:type="auto" w:w="0"/>
         <w:jc w:val="center"/>
         <w:tblLook w:firstColumn="1" w:firstRow="1" w:lastColumn="0" w:lastRow="0" w:noHBand="0" w:noVBand="1" w:val="04A0"/>
+        <w:tblBorders>
+          <w:top w:val="none"/>
+          <w:left w:val="none"/>
+          <w:bottom w:val="none"/>
+          <w:right w:val="none"/>
+          <w:insideH w:val="none"/>
+          <w:insideV w:val="none"/>
+        </w:tblBorders>
       </w:tblPr>
       <w:tblGrid>
         <w:gridCol w:w="4500"/>
@@ -257,7 +267,7 @@
           <w:i w:val="0"/>
           <w:sz w:val="24"/>
         </w:rPr>
-        <w:t>APSSDC Team &amp; Internal Faculty Guide</w:t>
+        <w:t>Mrs. M. Ruthuma &amp; APSSDC Team</w:t>
       </w:r>
     </w:p>
     <w:p>
@@ -283,7 +293,7 @@
           <w:color w:val="003366"/>
           <w:sz w:val="26"/>
         </w:rPr>
-        <w:t>SRI VENKATESWARA COLLEGE OF ENGINEERING AND TECHNOLOGY (SVCET)</w:t>
+        <w:t>SRI VENKATESWARA COLLEGE OF ENGINEERING AND TECHNOLOGY</w:t>
         <w:br/>
       </w:r>
       <w:r>
@@ -295,7 +305,7 @@
         </w:rPr>
         <w:t>(Autonomous)</w:t>
         <w:br/>
-        <w:t>Approved by AICTE, New Delhi &amp; Permanently Affiliated to JNTUA, Ananthapuramu</w:t>
+        <w:t>Approved by AICTE, New Delhi</w:t>
         <w:br/>
         <w:t>Accredited by NBA &amp; NAAC with 'A+' Grade</w:t>
         <w:br/>
@@ -329,7 +339,7 @@
           <w:i w:val="0"/>
           <w:sz w:val="26"/>
         </w:rPr>
-        <w:t>SRI VENKATESWARA COLLEGE OF ENGINEERING AND TECHNOLOGY (SVCET)</w:t>
+        <w:t>SRI VENKATESWARA COLLEGE OF ENGINEERING AND TECHNOLOGY</w:t>
         <w:br/>
       </w:r>
       <w:r>
@@ -343,7 +353,7 @@
         <w:br/>
         <w:t>(Autonomous)</w:t>
         <w:br/>
-        <w:t>Approved by AICTE, New Delhi &amp; Affiliated to JNTUA, Ananthapuramu</w:t>
+        <w:t>Approved by AICTE, New Delhi</w:t>
         <w:br/>
         <w:t>Accredited by NBA &amp; NAAC with 'A+' Grade</w:t>
         <w:br/>
@@ -436,7 +446,7 @@
           <w:i w:val="0"/>
           <w:sz w:val="24"/>
         </w:rPr>
-        <w:t xml:space="preserve"> to Jawaharlal Nehru Technological University Anantapur, Ananthapuramu, during the academic year 2025-2026.</w:t>
+        <w:t xml:space="preserve"> of SRI VENKATESWARA COLLEGE OF ENGINEERING AND TECHNOLOGY (AUTONOMOUS), CHITTOOR during the academic year 2025-2026.</w:t>
       </w:r>
     </w:p>
     <w:p>
@@ -449,6 +459,14 @@
         <w:tblW w:type="auto" w:w="0"/>
         <w:jc w:val="center"/>
         <w:tblLook w:firstColumn="1" w:firstRow="1" w:lastColumn="0" w:lastRow="0" w:noHBand="0" w:noVBand="1" w:val="04A0"/>
+        <w:tblBorders>
+          <w:top w:val="none"/>
+          <w:left w:val="none"/>
+          <w:bottom w:val="none"/>
+          <w:right w:val="none"/>
+          <w:insideH w:val="none"/>
+          <w:insideV w:val="none"/>
+        </w:tblBorders>
       </w:tblPr>
       <w:tblGrid>
         <w:gridCol w:w="4500"/>
@@ -486,11 +504,21 @@
             <w:r>
               <w:rPr>
                 <w:rFonts w:ascii="Times New Roman" w:hAnsi="Times New Roman"/>
+                <w:b/>
+                <w:i w:val="0"/>
+                <w:sz w:val="22"/>
+              </w:rPr>
+              <w:t>Mrs. M. Ruthuma &amp; APSSDC Team</w:t>
+              <w:br/>
+            </w:r>
+            <w:r>
+              <w:rPr>
+                <w:rFonts w:ascii="Times New Roman" w:hAnsi="Times New Roman"/>
                 <w:b w:val="0"/>
                 <w:i w:val="0"/>
                 <w:sz w:val="20"/>
               </w:rPr>
-              <w:t>[Designation, Dept. of CSE (AI &amp; ML)]</w:t>
+              <w:t>Dept. of CSE (AI &amp; ML)</w:t>
             </w:r>
           </w:p>
         </w:tc>
@@ -544,44 +572,6 @@
           </w:p>
         </w:tc>
       </w:tr>
-      <w:tr>
-        <w:tc>
-          <w:tcPr>
-            <w:tcW w:type="dxa" w:w="4500"/>
-          </w:tcPr>
-          <w:p>
-            <w:pPr>
-              <w:spacing w:before="800"/>
-              <w:jc w:val="left"/>
-            </w:pPr>
-            <w:r>
-              <w:rPr>
-                <w:rFonts w:ascii="Times New Roman" w:hAnsi="Times New Roman"/>
-                <w:b/>
-                <w:i w:val="0"/>
-                <w:sz w:val="22"/>
-              </w:rPr>
-              <w:t>_____________________</w:t>
-              <w:br/>
-            </w:r>
-            <w:r>
-              <w:rPr>
-                <w:rFonts w:ascii="Times New Roman" w:hAnsi="Times New Roman"/>
-                <w:b/>
-                <w:i w:val="0"/>
-                <w:sz w:val="22"/>
-              </w:rPr>
-              <w:t>External Examiner</w:t>
-            </w:r>
-          </w:p>
-        </w:tc>
-        <w:tc>
-          <w:tcPr>
-            <w:tcW w:type="dxa" w:w="4500"/>
-          </w:tcPr>
-          <w:p/>
-        </w:tc>
-      </w:tr>
     </w:tbl>
     <w:p>
       <w:r>
@@ -631,7 +621,7 @@
           <w:i w:val="0"/>
           <w:sz w:val="24"/>
         </w:rPr>
-        <w:t>We express our sincere gratitude to our internal faculty guide and the APSSDC Team for their constant guidance, valuable advice, and for providing us with the resources and tools required for the completion of this project. Their moral support and suggestions during the development of this project helped us to a greater extent.</w:t>
+        <w:t>We express our sincere gratitude to our internal faculty guide, Mrs. M. Ruthuma, and the APSSDC Team for their constant guidance, valuable advice, and for providing us with the resources and tools required for the completion of this project. Their moral support and suggestions during the development of this project helped us to a greater extent.</w:t>
       </w:r>
     </w:p>
     <w:p>
@@ -784,6 +774,14 @@
         <w:tblW w:type="auto" w:w="0"/>
         <w:jc w:val="center"/>
         <w:tblLook w:firstColumn="1" w:firstRow="1" w:lastColumn="0" w:lastRow="0" w:noHBand="0" w:noVBand="1" w:val="04A0"/>
+        <w:tblBorders>
+          <w:top w:val="none"/>
+          <w:left w:val="none"/>
+          <w:bottom w:val="none"/>
+          <w:right w:val="none"/>
+          <w:insideH w:val="none"/>
+          <w:insideV w:val="none"/>
+        </w:tblBorders>
       </w:tblPr>
       <w:tblGrid>
         <w:gridCol w:w="4500"/>

</xml_diff>